<commit_message>
Update OS Practical 7 doc and add PDF
Modify Operating-Systems/OS_Practical_7_SoniyaEG.docx and add a new PDF copy Operating-Systems/PRACTICAl07.pdf. Provides an updated DOCX and includes the PDF version of Practical 7 for distribution.
</commit_message>
<xml_diff>
--- a/Operating-Systems/OS_Practical_7_SoniyaEG.docx
+++ b/Operating-Systems/OS_Practical_7_SoniyaEG.docx
@@ -101,6 +101,7 @@
         <w:rPr>
           <w:b/>
           <w:bCs/>
+          <w:noProof/>
           <w:sz w:val="36"/>
           <w:szCs w:val="36"/>
           <w:lang w:val="en-US"/>
@@ -178,6 +179,7 @@
         <w:rPr>
           <w:b/>
           <w:bCs/>
+          <w:noProof/>
           <w:sz w:val="36"/>
           <w:szCs w:val="36"/>
           <w:lang w:val="en-US"/>
@@ -268,20 +270,30 @@
           <w:lang w:val="en-US"/>
         </w:rPr>
       </w:pPr>
-      <w:r>
-        <w:rPr>
-          <w:b/>
-          <w:bCs/>
-          <w:sz w:val="36"/>
-          <w:szCs w:val="36"/>
-          <w:lang w:val="en-US"/>
-        </w:rPr>
-        <w:lastRenderedPageBreak/>
+    </w:p>
+    <w:p>
+      <w:pPr>
+        <w:rPr>
+          <w:b/>
+          <w:bCs/>
+          <w:sz w:val="36"/>
+          <w:szCs w:val="36"/>
+          <w:lang w:val="en-US"/>
+        </w:rPr>
+      </w:pPr>
+      <w:r>
+        <w:rPr>
+          <w:b/>
+          <w:bCs/>
+          <w:sz w:val="36"/>
+          <w:szCs w:val="36"/>
+          <w:lang w:val="en-US"/>
+        </w:rPr>
         <w:drawing>
-          <wp:inline distT="0" distB="0" distL="0" distR="0" wp14:anchorId="74CAC7DE" wp14:editId="112B4973">
-            <wp:extent cx="5731510" cy="6517005"/>
+          <wp:inline distT="0" distB="0" distL="0" distR="0" wp14:anchorId="38537AA3" wp14:editId="440E2B4F">
+            <wp:extent cx="5731510" cy="5074920"/>
             <wp:effectExtent l="0" t="0" r="2540" b="0"/>
-            <wp:docPr id="1351227979" name="Picture 1"/>
+            <wp:docPr id="1457852038" name="Picture 1"/>
             <wp:cNvGraphicFramePr>
               <a:graphicFrameLocks xmlns:a="http://schemas.openxmlformats.org/drawingml/2006/main" noChangeAspect="1"/>
             </wp:cNvGraphicFramePr>
@@ -289,7 +301,7 @@
               <a:graphicData uri="http://schemas.openxmlformats.org/drawingml/2006/picture">
                 <pic:pic xmlns:pic="http://schemas.openxmlformats.org/drawingml/2006/picture">
                   <pic:nvPicPr>
-                    <pic:cNvPr id="1351227979" name=""/>
+                    <pic:cNvPr id="1457852038" name=""/>
                     <pic:cNvPicPr/>
                   </pic:nvPicPr>
                   <pic:blipFill>
@@ -301,7 +313,7 @@
                   <pic:spPr>
                     <a:xfrm>
                       <a:off x="0" y="0"/>
-                      <a:ext cx="5731510" cy="6517005"/>
+                      <a:ext cx="5731510" cy="5074920"/>
                     </a:xfrm>
                     <a:prstGeom prst="rect">
                       <a:avLst/>
@@ -353,11 +365,12 @@
           <w:szCs w:val="36"/>
           <w:lang w:val="en-US"/>
         </w:rPr>
+        <w:lastRenderedPageBreak/>
         <w:drawing>
-          <wp:inline distT="0" distB="0" distL="0" distR="0" wp14:anchorId="42D16AE8" wp14:editId="76FF1F4B">
-            <wp:extent cx="4086795" cy="1238423"/>
-            <wp:effectExtent l="0" t="0" r="0" b="0"/>
-            <wp:docPr id="1895147873" name="Picture 1"/>
+          <wp:inline distT="0" distB="0" distL="0" distR="0" wp14:anchorId="4ED37F89" wp14:editId="49C7BF18">
+            <wp:extent cx="4371975" cy="4030980"/>
+            <wp:effectExtent l="0" t="0" r="9525" b="7620"/>
+            <wp:docPr id="1587544419" name="Picture 1"/>
             <wp:cNvGraphicFramePr>
               <a:graphicFrameLocks xmlns:a="http://schemas.openxmlformats.org/drawingml/2006/main" noChangeAspect="1"/>
             </wp:cNvGraphicFramePr>
@@ -365,7 +378,7 @@
               <a:graphicData uri="http://schemas.openxmlformats.org/drawingml/2006/picture">
                 <pic:pic xmlns:pic="http://schemas.openxmlformats.org/drawingml/2006/picture">
                   <pic:nvPicPr>
-                    <pic:cNvPr id="1895147873" name=""/>
+                    <pic:cNvPr id="1587544419" name=""/>
                     <pic:cNvPicPr/>
                   </pic:nvPicPr>
                   <pic:blipFill>
@@ -377,7 +390,7 @@
                   <pic:spPr>
                     <a:xfrm>
                       <a:off x="0" y="0"/>
-                      <a:ext cx="4086795" cy="1238423"/>
+                      <a:ext cx="4372588" cy="4031545"/>
                     </a:xfrm>
                     <a:prstGeom prst="rect">
                       <a:avLst/>
@@ -401,42 +414,261 @@
         <w:rPr>
           <w:lang w:val="en-US"/>
         </w:rPr>
+        <w:t>Exercise:</w:t>
+      </w:r>
+    </w:p>
+    <w:p>
+      <w:pPr>
+        <w:spacing w:after="0"/>
+        <w:rPr>
+          <w:b/>
+          <w:bCs/>
+          <w:lang w:val="en-US"/>
+        </w:rPr>
+      </w:pPr>
+      <w:r>
+        <w:rPr>
+          <w:b/>
+          <w:bCs/>
+          <w:lang w:val="en-US"/>
+        </w:rPr>
+        <w:t>Q1. Consider a page reference string 1, 3, 0, 3, 5, 6 with 3-page frames. Find the</w:t>
+      </w:r>
+    </w:p>
+    <w:p>
+      <w:pPr>
+        <w:spacing w:after="0"/>
+        <w:rPr>
+          <w:b/>
+          <w:bCs/>
+          <w:lang w:val="en-US"/>
+        </w:rPr>
+      </w:pPr>
+      <w:r>
+        <w:rPr>
+          <w:b/>
+          <w:bCs/>
+          <w:lang w:val="en-US"/>
+        </w:rPr>
+        <w:t>number of page faults &amp;amp; Page Hit? Use FIFO algorithm.</w:t>
+      </w:r>
+    </w:p>
+    <w:p>
+      <w:pPr>
+        <w:rPr>
+          <w:b/>
+          <w:bCs/>
+          <w:sz w:val="36"/>
+          <w:szCs w:val="36"/>
+          <w:lang w:val="en-US"/>
+        </w:rPr>
+      </w:pPr>
+      <w:r>
+        <w:rPr>
+          <w:b/>
+          <w:bCs/>
+          <w:sz w:val="36"/>
+          <w:szCs w:val="36"/>
+          <w:lang w:val="en-US"/>
+        </w:rPr>
+        <w:t>Code:</w:t>
+      </w:r>
+    </w:p>
+    <w:p>
+      <w:pPr>
+        <w:rPr>
+          <w:b/>
+          <w:bCs/>
+          <w:sz w:val="36"/>
+          <w:szCs w:val="36"/>
+          <w:lang w:val="en-US"/>
+        </w:rPr>
+      </w:pPr>
+      <w:r>
+        <w:rPr>
+          <w:b/>
+          <w:bCs/>
+          <w:sz w:val="36"/>
+          <w:szCs w:val="36"/>
+          <w:lang w:val="en-US"/>
+        </w:rPr>
         <w:lastRenderedPageBreak/>
-        <w:t>Exercise:</w:t>
-      </w:r>
-    </w:p>
-    <w:p>
-      <w:pPr>
-        <w:rPr>
-          <w:b/>
-          <w:bCs/>
-          <w:lang w:val="en-US"/>
-        </w:rPr>
-      </w:pPr>
-      <w:r>
-        <w:rPr>
-          <w:b/>
-          <w:bCs/>
-          <w:lang w:val="en-US"/>
-        </w:rPr>
-        <w:t>Q1. Consider a page reference string 1, 3, 0, 3, 5, 6 with 3-page frames. Find the</w:t>
-      </w:r>
-    </w:p>
-    <w:p>
-      <w:pPr>
-        <w:rPr>
-          <w:b/>
-          <w:bCs/>
-          <w:lang w:val="en-US"/>
-        </w:rPr>
-      </w:pPr>
-      <w:r>
-        <w:rPr>
-          <w:b/>
-          <w:bCs/>
-          <w:lang w:val="en-US"/>
-        </w:rPr>
-        <w:t>number of page faults &amp;amp; Page Hit? Use FIFO algorithm.</w:t>
+        <w:drawing>
+          <wp:inline distT="0" distB="0" distL="0" distR="0" wp14:anchorId="2651E733" wp14:editId="5E481A49">
+            <wp:extent cx="5731510" cy="4899660"/>
+            <wp:effectExtent l="0" t="0" r="2540" b="3810"/>
+            <wp:docPr id="714076789" name="Picture 1"/>
+            <wp:cNvGraphicFramePr>
+              <a:graphicFrameLocks xmlns:a="http://schemas.openxmlformats.org/drawingml/2006/main" noChangeAspect="1"/>
+            </wp:cNvGraphicFramePr>
+            <a:graphic xmlns:a="http://schemas.openxmlformats.org/drawingml/2006/main">
+              <a:graphicData uri="http://schemas.openxmlformats.org/drawingml/2006/picture">
+                <pic:pic xmlns:pic="http://schemas.openxmlformats.org/drawingml/2006/picture">
+                  <pic:nvPicPr>
+                    <pic:cNvPr id="714076789" name=""/>
+                    <pic:cNvPicPr/>
+                  </pic:nvPicPr>
+                  <pic:blipFill>
+                    <a:blip r:embed="rId8"/>
+                    <a:stretch>
+                      <a:fillRect/>
+                    </a:stretch>
+                  </pic:blipFill>
+                  <pic:spPr>
+                    <a:xfrm>
+                      <a:off x="0" y="0"/>
+                      <a:ext cx="5731510" cy="4899660"/>
+                    </a:xfrm>
+                    <a:prstGeom prst="rect">
+                      <a:avLst/>
+                    </a:prstGeom>
+                  </pic:spPr>
+                </pic:pic>
+              </a:graphicData>
+            </a:graphic>
+          </wp:inline>
+        </w:drawing>
+      </w:r>
+    </w:p>
+    <w:p>
+      <w:pPr>
+        <w:rPr>
+          <w:b/>
+          <w:bCs/>
+          <w:sz w:val="36"/>
+          <w:szCs w:val="36"/>
+          <w:lang w:val="en-US"/>
+        </w:rPr>
+      </w:pPr>
+      <w:r>
+        <w:rPr>
+          <w:b/>
+          <w:bCs/>
+          <w:sz w:val="36"/>
+          <w:szCs w:val="36"/>
+          <w:lang w:val="en-US"/>
+        </w:rPr>
+        <w:t>Output:</w:t>
+      </w:r>
+    </w:p>
+    <w:p>
+      <w:pPr>
+        <w:rPr>
+          <w:b/>
+          <w:bCs/>
+          <w:sz w:val="36"/>
+          <w:szCs w:val="36"/>
+          <w:lang w:val="en-US"/>
+        </w:rPr>
+      </w:pPr>
+      <w:r>
+        <w:rPr>
+          <w:b/>
+          <w:bCs/>
+          <w:sz w:val="36"/>
+          <w:szCs w:val="36"/>
+          <w:lang w:val="en-US"/>
+        </w:rPr>
+        <w:drawing>
+          <wp:inline distT="0" distB="0" distL="0" distR="0" wp14:anchorId="3DB4F03F" wp14:editId="61718211">
+            <wp:extent cx="3772426" cy="2867425"/>
+            <wp:effectExtent l="0" t="0" r="0" b="9525"/>
+            <wp:docPr id="198207033" name="Picture 1"/>
+            <wp:cNvGraphicFramePr>
+              <a:graphicFrameLocks xmlns:a="http://schemas.openxmlformats.org/drawingml/2006/main" noChangeAspect="1"/>
+            </wp:cNvGraphicFramePr>
+            <a:graphic xmlns:a="http://schemas.openxmlformats.org/drawingml/2006/main">
+              <a:graphicData uri="http://schemas.openxmlformats.org/drawingml/2006/picture">
+                <pic:pic xmlns:pic="http://schemas.openxmlformats.org/drawingml/2006/picture">
+                  <pic:nvPicPr>
+                    <pic:cNvPr id="198207033" name=""/>
+                    <pic:cNvPicPr/>
+                  </pic:nvPicPr>
+                  <pic:blipFill>
+                    <a:blip r:embed="rId9"/>
+                    <a:stretch>
+                      <a:fillRect/>
+                    </a:stretch>
+                  </pic:blipFill>
+                  <pic:spPr>
+                    <a:xfrm>
+                      <a:off x="0" y="0"/>
+                      <a:ext cx="3772426" cy="2867425"/>
+                    </a:xfrm>
+                    <a:prstGeom prst="rect">
+                      <a:avLst/>
+                    </a:prstGeom>
+                  </pic:spPr>
+                </pic:pic>
+              </a:graphicData>
+            </a:graphic>
+          </wp:inline>
+        </w:drawing>
+      </w:r>
+    </w:p>
+    <w:p>
+      <w:pPr>
+        <w:spacing w:after="0"/>
+        <w:rPr>
+          <w:b/>
+          <w:bCs/>
+          <w:lang w:val="en-US"/>
+        </w:rPr>
+      </w:pPr>
+      <w:r>
+        <w:rPr>
+          <w:b/>
+          <w:bCs/>
+          <w:lang w:val="en-US"/>
+        </w:rPr>
+        <w:t xml:space="preserve">Q2. Consider a reference string 1, 2, 1, 0, 3, 0, 4, 2, 4. We have 3 </w:t>
+      </w:r>
+      <w:proofErr w:type="gramStart"/>
+      <w:r>
+        <w:rPr>
+          <w:b/>
+          <w:bCs/>
+          <w:lang w:val="en-US"/>
+        </w:rPr>
+        <w:t>empty</w:t>
+      </w:r>
+      <w:proofErr w:type="gramEnd"/>
+    </w:p>
+    <w:p>
+      <w:pPr>
+        <w:spacing w:after="0"/>
+        <w:rPr>
+          <w:b/>
+          <w:bCs/>
+          <w:lang w:val="en-US"/>
+        </w:rPr>
+      </w:pPr>
+      <w:r>
+        <w:rPr>
+          <w:b/>
+          <w:bCs/>
+          <w:lang w:val="en-US"/>
+        </w:rPr>
+        <w:lastRenderedPageBreak/>
+        <w:t>memory locations available. Find the number of page hits and page faults? Use</w:t>
+      </w:r>
+    </w:p>
+    <w:p>
+      <w:pPr>
+        <w:spacing w:after="0"/>
+        <w:rPr>
+          <w:b/>
+          <w:bCs/>
+          <w:lang w:val="en-US"/>
+        </w:rPr>
+      </w:pPr>
+      <w:r>
+        <w:rPr>
+          <w:b/>
+          <w:bCs/>
+          <w:lang w:val="en-US"/>
+        </w:rPr>
+        <w:t>LRU algorithm.</w:t>
       </w:r>
     </w:p>
     <w:p>
@@ -478,118 +710,111 @@
           <w:szCs w:val="36"/>
           <w:lang w:val="en-US"/>
         </w:rPr>
+        <w:drawing>
+          <wp:inline distT="0" distB="0" distL="0" distR="0" wp14:anchorId="3D401E21" wp14:editId="7761AB33">
+            <wp:extent cx="5438762" cy="7543165"/>
+            <wp:effectExtent l="0" t="0" r="0" b="635"/>
+            <wp:docPr id="1174915662" name="Picture 1"/>
+            <wp:cNvGraphicFramePr>
+              <a:graphicFrameLocks xmlns:a="http://schemas.openxmlformats.org/drawingml/2006/main" noChangeAspect="1"/>
+            </wp:cNvGraphicFramePr>
+            <a:graphic xmlns:a="http://schemas.openxmlformats.org/drawingml/2006/main">
+              <a:graphicData uri="http://schemas.openxmlformats.org/drawingml/2006/picture">
+                <pic:pic xmlns:pic="http://schemas.openxmlformats.org/drawingml/2006/picture">
+                  <pic:nvPicPr>
+                    <pic:cNvPr id="1174915662" name=""/>
+                    <pic:cNvPicPr/>
+                  </pic:nvPicPr>
+                  <pic:blipFill>
+                    <a:blip r:embed="rId10"/>
+                    <a:stretch>
+                      <a:fillRect/>
+                    </a:stretch>
+                  </pic:blipFill>
+                  <pic:spPr>
+                    <a:xfrm>
+                      <a:off x="0" y="0"/>
+                      <a:ext cx="5450293" cy="7559158"/>
+                    </a:xfrm>
+                    <a:prstGeom prst="rect">
+                      <a:avLst/>
+                    </a:prstGeom>
+                  </pic:spPr>
+                </pic:pic>
+              </a:graphicData>
+            </a:graphic>
+          </wp:inline>
+        </w:drawing>
+      </w:r>
+    </w:p>
+    <w:p>
+      <w:pPr>
+        <w:rPr>
+          <w:b/>
+          <w:bCs/>
+          <w:sz w:val="36"/>
+          <w:szCs w:val="36"/>
+          <w:lang w:val="en-US"/>
+        </w:rPr>
+      </w:pPr>
+      <w:r>
+        <w:rPr>
+          <w:b/>
+          <w:bCs/>
+          <w:sz w:val="36"/>
+          <w:szCs w:val="36"/>
+          <w:lang w:val="en-US"/>
+        </w:rPr>
         <w:t>Output:</w:t>
       </w:r>
     </w:p>
     <w:p>
       <w:pPr>
         <w:rPr>
-          <w:b/>
-          <w:bCs/>
-          <w:lang w:val="en-US"/>
-        </w:rPr>
-      </w:pPr>
-      <w:r>
-        <w:rPr>
-          <w:b/>
-          <w:bCs/>
-          <w:lang w:val="en-US"/>
-        </w:rPr>
-        <w:t xml:space="preserve">Q2. Consider a reference string 1, 2, 1, 0, 3, 0, 4, 2, 4. We have 3 </w:t>
-      </w:r>
-      <w:proofErr w:type="gramStart"/>
-      <w:r>
-        <w:rPr>
-          <w:b/>
-          <w:bCs/>
-          <w:lang w:val="en-US"/>
-        </w:rPr>
-        <w:t>empty</w:t>
-      </w:r>
-      <w:proofErr w:type="gramEnd"/>
-    </w:p>
-    <w:p>
-      <w:pPr>
-        <w:rPr>
-          <w:b/>
-          <w:bCs/>
-          <w:lang w:val="en-US"/>
-        </w:rPr>
-      </w:pPr>
-      <w:r>
-        <w:rPr>
-          <w:b/>
-          <w:bCs/>
-          <w:lang w:val="en-US"/>
-        </w:rPr>
-        <w:t>memory locations available. Find the number of page hits and page faults? Use</w:t>
-      </w:r>
-    </w:p>
-    <w:p>
-      <w:pPr>
-        <w:rPr>
-          <w:b/>
-          <w:bCs/>
-          <w:lang w:val="en-US"/>
-        </w:rPr>
-      </w:pPr>
-      <w:r>
-        <w:rPr>
-          <w:b/>
-          <w:bCs/>
-          <w:lang w:val="en-US"/>
-        </w:rPr>
-        <w:t>LRU algorithm.</w:t>
-      </w:r>
-    </w:p>
-    <w:p>
-      <w:pPr>
-        <w:rPr>
-          <w:b/>
-          <w:bCs/>
-          <w:sz w:val="36"/>
-          <w:szCs w:val="36"/>
-          <w:lang w:val="en-US"/>
-        </w:rPr>
-      </w:pPr>
-      <w:r>
-        <w:rPr>
-          <w:b/>
-          <w:bCs/>
-          <w:sz w:val="36"/>
-          <w:szCs w:val="36"/>
-          <w:lang w:val="en-US"/>
-        </w:rPr>
-        <w:t>Code:</w:t>
-      </w:r>
-    </w:p>
-    <w:p>
-      <w:pPr>
-        <w:rPr>
-          <w:b/>
-          <w:bCs/>
-          <w:sz w:val="36"/>
-          <w:szCs w:val="36"/>
-          <w:lang w:val="en-US"/>
-        </w:rPr>
-      </w:pPr>
-      <w:r>
-        <w:rPr>
-          <w:b/>
-          <w:bCs/>
-          <w:sz w:val="36"/>
-          <w:szCs w:val="36"/>
-          <w:lang w:val="en-US"/>
-        </w:rPr>
-        <w:t>Output:</w:t>
-      </w:r>
-    </w:p>
-    <w:p>
-      <w:pPr>
-        <w:rPr>
-          <w:lang w:val="en-US"/>
-        </w:rPr>
-      </w:pPr>
+          <w:lang w:val="en-US"/>
+        </w:rPr>
+      </w:pPr>
+      <w:r>
+        <w:rPr>
+          <w:lang w:val="en-US"/>
+        </w:rPr>
+        <w:lastRenderedPageBreak/>
+        <w:drawing>
+          <wp:inline distT="0" distB="0" distL="0" distR="0" wp14:anchorId="13115A58" wp14:editId="1BC38B42">
+            <wp:extent cx="3991532" cy="3267531"/>
+            <wp:effectExtent l="0" t="0" r="9525" b="9525"/>
+            <wp:docPr id="1660099967" name="Picture 1"/>
+            <wp:cNvGraphicFramePr>
+              <a:graphicFrameLocks xmlns:a="http://schemas.openxmlformats.org/drawingml/2006/main" noChangeAspect="1"/>
+            </wp:cNvGraphicFramePr>
+            <a:graphic xmlns:a="http://schemas.openxmlformats.org/drawingml/2006/main">
+              <a:graphicData uri="http://schemas.openxmlformats.org/drawingml/2006/picture">
+                <pic:pic xmlns:pic="http://schemas.openxmlformats.org/drawingml/2006/picture">
+                  <pic:nvPicPr>
+                    <pic:cNvPr id="1660099967" name=""/>
+                    <pic:cNvPicPr/>
+                  </pic:nvPicPr>
+                  <pic:blipFill>
+                    <a:blip r:embed="rId11"/>
+                    <a:stretch>
+                      <a:fillRect/>
+                    </a:stretch>
+                  </pic:blipFill>
+                  <pic:spPr>
+                    <a:xfrm>
+                      <a:off x="0" y="0"/>
+                      <a:ext cx="3991532" cy="3267531"/>
+                    </a:xfrm>
+                    <a:prstGeom prst="rect">
+                      <a:avLst/>
+                    </a:prstGeom>
+                  </pic:spPr>
+                </pic:pic>
+              </a:graphicData>
+            </a:graphic>
+          </wp:inline>
+        </w:drawing>
+      </w:r>
     </w:p>
     <w:sectPr>
       <w:pgSz w:w="11906" w:h="16838"/>

</xml_diff>